<commit_message>
Add Lab 3 and update project files
</commit_message>
<xml_diff>
--- a/LAB-2/Web-Engineering-Lab-2.docx
+++ b/LAB-2/Web-Engineering-Lab-2.docx
@@ -6376,8 +6376,10 @@
           <w:szCs w:val="24"/>
           <w:lang w:val="en-US"/>
         </w:rPr>
-        <w:t xml:space="preserve">Repo link: </w:t>
-      </w:r>
+        <w:t>Repo link: https://github.com/AreejZahra92/Web-Engineering-Labs</w:t>
+      </w:r>
+      <w:bookmarkStart w:id="0" w:name="_GoBack"/>
+      <w:bookmarkEnd w:id="0"/>
     </w:p>
     <w:p>
       <w:pPr>
@@ -6544,8 +6546,6 @@
           <w:lang w:val="en-US"/>
         </w:rPr>
       </w:pPr>
-      <w:bookmarkStart w:id="0" w:name="_GoBack"/>
-      <w:bookmarkEnd w:id="0"/>
     </w:p>
     <w:sectPr>
       <w:pgSz w:w="11906" w:h="16838"/>
@@ -6633,7 +6633,7 @@
     <w:lsdException w:qFormat="1" w:unhideWhenUsed="0" w:uiPriority="0" w:semiHidden="0" w:name="Title"/>
     <w:lsdException w:unhideWhenUsed="0" w:uiPriority="0" w:semiHidden="0" w:name="Closing"/>
     <w:lsdException w:unhideWhenUsed="0" w:uiPriority="0" w:semiHidden="0" w:name="Signature"/>
-    <w:lsdException w:unhideWhenUsed="0" w:uiPriority="0" w:name="Default Paragraph Font"/>
+    <w:lsdException w:qFormat="1" w:unhideWhenUsed="0" w:uiPriority="0" w:name="Default Paragraph Font"/>
     <w:lsdException w:unhideWhenUsed="0" w:uiPriority="0" w:semiHidden="0" w:name="Body Text"/>
     <w:lsdException w:unhideWhenUsed="0" w:uiPriority="0" w:semiHidden="0" w:name="Body Text Indent"/>
     <w:lsdException w:unhideWhenUsed="0" w:uiPriority="0" w:semiHidden="0" w:name="List Continue"/>
@@ -6660,18 +6660,18 @@
     <w:lsdException w:unhideWhenUsed="0" w:uiPriority="0" w:semiHidden="0" w:name="Document Map"/>
     <w:lsdException w:unhideWhenUsed="0" w:uiPriority="0" w:semiHidden="0" w:name="Plain Text"/>
     <w:lsdException w:unhideWhenUsed="0" w:uiPriority="0" w:semiHidden="0" w:name="E-mail Signature"/>
-    <w:lsdException w:unhideWhenUsed="0" w:uiPriority="0" w:semiHidden="0" w:name="Normal (Web)"/>
+    <w:lsdException w:qFormat="1" w:unhideWhenUsed="0" w:uiPriority="0" w:semiHidden="0" w:name="Normal (Web)"/>
     <w:lsdException w:unhideWhenUsed="0" w:uiPriority="0" w:semiHidden="0" w:name="HTML Acronym"/>
     <w:lsdException w:unhideWhenUsed="0" w:uiPriority="0" w:semiHidden="0" w:name="HTML Address"/>
     <w:lsdException w:unhideWhenUsed="0" w:uiPriority="0" w:semiHidden="0" w:name="HTML Cite"/>
-    <w:lsdException w:unhideWhenUsed="0" w:uiPriority="0" w:semiHidden="0" w:name="HTML Code"/>
+    <w:lsdException w:qFormat="1" w:unhideWhenUsed="0" w:uiPriority="0" w:semiHidden="0" w:name="HTML Code"/>
     <w:lsdException w:unhideWhenUsed="0" w:uiPriority="0" w:semiHidden="0" w:name="HTML Definition"/>
     <w:lsdException w:unhideWhenUsed="0" w:uiPriority="0" w:semiHidden="0" w:name="HTML Keyboard"/>
     <w:lsdException w:unhideWhenUsed="0" w:uiPriority="0" w:semiHidden="0" w:name="HTML Preformatted"/>
     <w:lsdException w:unhideWhenUsed="0" w:uiPriority="0" w:semiHidden="0" w:name="HTML Sample"/>
     <w:lsdException w:unhideWhenUsed="0" w:uiPriority="0" w:semiHidden="0" w:name="HTML Typewriter"/>
     <w:lsdException w:unhideWhenUsed="0" w:uiPriority="0" w:semiHidden="0" w:name="HTML Variable"/>
-    <w:lsdException w:unhideWhenUsed="0" w:uiPriority="0" w:name="Normal Table"/>
+    <w:lsdException w:qFormat="1" w:unhideWhenUsed="0" w:uiPriority="0" w:name="Normal Table"/>
     <w:lsdException w:unhideWhenUsed="0" w:uiPriority="0" w:semiHidden="0" w:name="annotation subject"/>
     <w:lsdException w:unhideWhenUsed="0" w:uiPriority="0" w:semiHidden="0" w:name="Table Simple 1"/>
     <w:lsdException w:unhideWhenUsed="0" w:uiPriority="0" w:semiHidden="0" w:name="Table Simple 2"/>
@@ -6829,11 +6829,13 @@
   <w:style w:type="character" w:default="1" w:styleId="2">
     <w:name w:val="Default Paragraph Font"/>
     <w:semiHidden/>
+    <w:qFormat/>
     <w:uiPriority w:val="0"/>
   </w:style>
   <w:style w:type="table" w:default="1" w:styleId="3">
     <w:name w:val="Normal Table"/>
     <w:semiHidden/>
+    <w:qFormat/>
     <w:uiPriority w:val="0"/>
     <w:tblPr>
       <w:tblCellMar>
@@ -6847,6 +6849,7 @@
   <w:style w:type="character" w:styleId="4">
     <w:name w:val="HTML Code"/>
     <w:basedOn w:val="2"/>
+    <w:qFormat/>
     <w:uiPriority w:val="0"/>
     <w:rPr>
       <w:rFonts w:ascii="Courier New" w:hAnsi="Courier New" w:cs="Courier New"/>
@@ -6856,6 +6859,7 @@
   </w:style>
   <w:style w:type="paragraph" w:styleId="5">
     <w:name w:val="Normal (Web)"/>
+    <w:qFormat/>
     <w:uiPriority w:val="0"/>
     <w:pPr>
       <w:spacing w:before="0" w:beforeAutospacing="1" w:after="0" w:afterAutospacing="1"/>
@@ -6863,6 +6867,7 @@
       <w:jc w:val="left"/>
     </w:pPr>
     <w:rPr>
+      <w:rFonts w:ascii="Times New Roman" w:hAnsi="Times New Roman" w:eastAsia="SimSun" w:cs="Times New Roman"/>
       <w:kern w:val="0"/>
       <w:sz w:val="24"/>
       <w:szCs w:val="24"/>

</xml_diff>